<commit_message>
Require complete archive details
</commit_message>
<xml_diff>
--- a/public/assets/member-profile-word-template.docx
+++ b/public/assets/member-profile-word-template.docx
@@ -62,22 +62,6 @@
           <w:szCs w:val="21"/>
         </w:rPr>
       </w:pPr>
-      <w:r>
-        <w:rPr>
-          <w:rFonts w:ascii="等线" w:hAnsi="等线" w:eastAsia="等线" w:cs="等线"/>
-          <w:spacing w:val="-14"/>
-          <w:sz w:val="21"/>
-          <w:szCs w:val="21"/>
-        </w:rPr>
-        <w:t>编号：</w:t>
-      </w:r>
-      <w:r>
-        <w:rPr>
-          <w:rFonts w:ascii="宋体" w:hAnsi="宋体"/>
-          <w:sz w:val="16"/>
-        </w:rPr>
-        <w:t>{{number}}</w:t>
-      </w:r>
     </w:p>
     <w:tbl>
       <w:tblPr>

</xml_diff>